<commit_message>
CV: rewrite About-me scope sentence, add 31P and CASTEP, drop contact-time and tuning details
Co-Authored-By: Claude Opus 5.5 <noreply@anthropic.com>
Claude-Session: https://claude.ai/code/session_0181Py7YxLpCBh38bWHRgX5o
</commit_message>
<xml_diff>
--- a/01_documentos/cv-dazaet_galicia_Manchester_ssNMR_SAE-032399.docx
+++ b/01_documentos/cv-dazaet_galicia_Manchester_ssNMR_SAE-032399.docx
@@ -195,7 +195,7 @@
           <w:color w:val="1A1A1A"/>
           <w:lang w:val="en-US"/>
         </w:rPr>
-        <w:t xml:space="preserve"> on the design and synthesis of organic and metal-organic framework materials exhibiting dynamics across multiple length scales</w:t>
+        <w:t xml:space="preserve"> on the design and synthesis of organic crystals and metal-organic frameworks exhibiting dynamics from the molecular level to the macroscopic level</w:t>
       </w:r>
       <w:r>
         <w:rPr>
@@ -209,7 +209,7 @@
           <w:color w:val="1A1A1A"/>
           <w:lang w:val="en-US"/>
         </w:rPr>
-        <w:t>from molecular-level rotational motion and photoisomerization to macroscopic phenomena such as crystal flexibility, salient mechanical responses, and single-crystal-to-single-crystal phase transitions.</w:t>
+        <w:t>including rotational motion, photoisomerization, crystal flexibility, salient mechanical responses, and single-crystal-to-single-crystal phase transitions.</w:t>
       </w:r>
       <w:r>
         <w:rPr>
@@ -223,7 +223,7 @@
           <w:color w:val="1A1A1A"/>
           <w:lang w:val="en-US"/>
         </w:rPr>
-        <w:t>I bring a strong experimental toolkit: organic synthesis, multinuclear solid-state NMR (¹³C, ¹⁹F, ²H, ¹⁵N), single-crystal and powder X-ray diffraction (SCXRD/PXRD), fluorimetry, and DFT calculations.</w:t>
+        <w:t>I bring a strong experimental toolkit: organic synthesis, multinuclear solid-state NMR (¹³C, ¹⁹F, ³¹P, ²H, ¹⁵N), single-crystal and powder X-ray diffraction (SCXRD/PXRD), fluorimetry, and DFT calculations.</w:t>
       </w:r>
       <w:r>
         <w:rPr>
@@ -1144,7 +1144,7 @@
           <w:color w:val="000000" w:themeColor="text1"/>
           <w:lang w:val="en-US"/>
         </w:rPr>
-        <w:t>: Organic synthesis, including air- and moisture-sensitive reactions (Schlenk techniques); MOF solvothermal synthesis and post-synthetic modification (PSM). Solid-state NMR (Bruker 500 MHz, double-resonance ¹H/X MAS probe): ¹³C CP-MAS with variable contact time, ¹⁹F MAS, variable-temperature ²H and ¹⁵N CP-MAS; probe tuning and matching; ²H lineshape simulation; analysis of ¹³C T₁ and solid-state ¹H and ¹⁹F relaxometry data. X-ray diffraction: SCXRD and PXRD, including variable-temperature studies and structure refinement (ShelX). Photophysics: steady-state and time-resolved fluorescence, UV–Vis absorption. Thermal analysis: hot-stage microscopy, DSC, TGA.</w:t>
+        <w:t>: Organic synthesis, including air- and moisture-sensitive reactions (Schlenk techniques); MOF solvothermal synthesis and post-synthetic modification (PSM). Solid-state NMR (Bruker 500 MHz, double-resonance ¹H/X MAS probe): ¹³C CP-MAS, ¹⁹F MAS, ³¹P, variable-temperature ²H and ¹⁵N CP-MAS; ²H lineshape simulation; DFT calculation of NMR parameters (CASTEP); analysis of ¹³C T₁ and solid-state ¹H and ¹⁹F relaxometry data. X-ray diffraction: SCXRD and PXRD, including variable-temperature studies and structure refinement (ShelX). Photophysics: steady-state and time-resolved fluorescence, UV–Vis absorption. Thermal analysis: hot-stage microscopy, DSC, TGA.</w:t>
       </w:r>
       <w:r>
         <w:rPr>
@@ -1170,7 +1170,7 @@
           <w:color w:val="000000" w:themeColor="text1"/>
           <w:lang w:val="en-US"/>
         </w:rPr>
-        <w:t xml:space="preserve"> DFT calculations (geometry optimization, electronic structure, energy profiles, PES) in Gaussian16; periodic DFT in CP2K and molecular dynamics simulations (LAMMPS) on HPC clusters. Crystallography tools: ShelX, CrystalDiffract, CCDC suite. Visualization: CrystalMaker, ChemDraw. NMR processing and simulation: TopSpin, MestreNova, NMR WebLab. AI-assisted workflows for research automation and data analysis.</w:t>
+        <w:t xml:space="preserve"> DFT calculations (geometry optimization, electronic structure, energy profiles, PES) in Gaussian16; periodic DFT in CP2K and molecular dynamics simulations (LAMMPS) on HPC clusters. Crystallography tools: ShelX, CrystalDiffract, CCDC suite. Visualization: CrystalMaker, ChemDraw. NMR processing and simulation: TopSpin, MestreNova, NMR WebLab, CASTEP. AI-assisted workflows for research automation and data analysis.</w:t>
       </w:r>
       <w:r>
         <w:rPr>

</xml_diff>